<commit_message>
WO-REF01-060-B18-REF-C025-FIELD-CORRECTION-003: REF-C025 세부 입력란 가시화
CORRECTION-003: S03(사전 위험확인)·S04(격리방호) 단일 freeform을
5개 독립 freeform_area(S03~S07)로 분리하여 각 항목이
PDF/DOCX에 별도 label로 표시되도록 수정.
섹션 수 6→9 (S08=approval, S09=작업종료확인).
385/385 PASS. 기존 292개 출력물 및 PRA-22-04 불변.

Co-Authored-By: Claude Sonnet 4.6 <noreply@anthropic.com>
</commit_message>
<xml_diff>
--- a/docs/reference-forms/output/TAI-FORM-C025-blank.docx
+++ b/docs/reference-forms/output/TAI-FORM-C025-blank.docx
@@ -617,14 +617,14 @@
                 <w:sz w:val="20"/>
                 <w:szCs w:val="20"/>
               </w:rPr>
-              <w:t xml:space="preserve">사전 위험확인</w:t>
-            </w:r>
-          </w:p>
-        </w:tc>
-      </w:tr>
-      <w:tr>
-        <w:trPr>
-          <w:trHeight w:val="1133" w:hRule="atLeast"/>
+              <w:t xml:space="preserve">사전 위험확인 결과</w:t>
+            </w:r>
+          </w:p>
+        </w:tc>
+      </w:tr>
+      <w:tr>
+        <w:trPr>
+          <w:trHeight w:val="793" w:hRule="atLeast"/>
         </w:trPr>
         <w:tc>
           <w:tcPr>
@@ -709,14 +709,290 @@
                 <w:sz w:val="20"/>
                 <w:szCs w:val="20"/>
               </w:rPr>
-              <w:t xml:space="preserve">격리·방호 조치</w:t>
-            </w:r>
-          </w:p>
-        </w:tc>
-      </w:tr>
-      <w:tr>
-        <w:trPr>
-          <w:trHeight w:val="1133" w:hRule="atLeast"/>
+              <w:t xml:space="preserve">주요 위험요인</w:t>
+            </w:r>
+          </w:p>
+        </w:tc>
+      </w:tr>
+      <w:tr>
+        <w:trPr>
+          <w:trHeight w:val="793" w:hRule="atLeast"/>
+        </w:trPr>
+        <w:tc>
+          <w:tcPr>
+            <w:tcW w:type="dxa" w:w="9637"/>
+            <w:tcBorders>
+              <w:top w:val="single" w:color="000000" w:sz="4"/>
+              <w:left w:val="single" w:color="000000" w:sz="4"/>
+              <w:bottom w:val="single" w:color="000000" w:sz="4"/>
+              <w:right w:val="single" w:color="000000" w:sz="4"/>
+            </w:tcBorders>
+            <w:shd w:fill="F5F5F5" w:color="auto" w:val="clear"/>
+            <w:tcMar>
+              <w:top w:type="dxa" w:w="170"/>
+              <w:left w:type="dxa" w:w="170"/>
+              <w:bottom w:type="dxa" w:w="170"/>
+              <w:right w:type="dxa" w:w="170"/>
+            </w:tcMar>
+          </w:tcPr>
+          <w:p>
+            <w:r>
+              <w:t xml:space="preserve"/>
+            </w:r>
+          </w:p>
+        </w:tc>
+      </w:tr>
+    </w:tbl>
+    <w:p>
+      <w:pPr>
+        <w:spacing w:after="80" w:before="80"/>
+      </w:pPr>
+      <w:r>
+        <w:t xml:space="preserve"/>
+      </w:r>
+    </w:p>
+    <w:tbl>
+      <w:tblPr>
+        <w:tblW w:type="dxa" w:w="9637"/>
+        <w:tblBorders>
+          <w:top w:val="single" w:color="auto" w:sz="4"/>
+          <w:left w:val="single" w:color="auto" w:sz="4"/>
+          <w:bottom w:val="single" w:color="auto" w:sz="4"/>
+          <w:right w:val="single" w:color="auto" w:sz="4"/>
+          <w:insideH w:val="single" w:color="auto" w:sz="4"/>
+          <w:insideV w:val="single" w:color="auto" w:sz="4"/>
+        </w:tblBorders>
+        <w:tblLayout w:type="fixed"/>
+      </w:tblPr>
+      <w:tblGrid>
+        <w:gridCol w:w="9637"/>
+      </w:tblGrid>
+      <w:tr>
+        <w:trPr>
+          <w:trHeight w:val="396" w:hRule="atLeast"/>
+        </w:trPr>
+        <w:tc>
+          <w:tcPr>
+            <w:tcW w:type="dxa" w:w="9637"/>
+            <w:tcBorders>
+              <w:top w:val="single" w:color="000000" w:sz="4"/>
+              <w:left w:val="single" w:color="000000" w:sz="4"/>
+              <w:bottom w:val="single" w:color="000000" w:sz="4"/>
+              <w:right w:val="single" w:color="000000" w:sz="4"/>
+            </w:tcBorders>
+            <w:shd w:fill="E8E8E8" w:color="auto" w:val="clear"/>
+            <w:tcMar>
+              <w:top w:type="dxa" w:w="170"/>
+              <w:left w:type="dxa" w:w="170"/>
+              <w:bottom w:type="dxa" w:w="170"/>
+              <w:right w:type="dxa" w:w="170"/>
+            </w:tcMar>
+            <w:vAlign w:val="center"/>
+          </w:tcPr>
+          <w:p>
+            <w:pPr>
+              <w:jc w:val="center"/>
+            </w:pPr>
+            <w:r>
+              <w:rPr>
+                <w:rFonts w:ascii="NanumGothic" w:cs="NanumGothic" w:eastAsia="NanumGothic" w:hAnsi="NanumGothic"/>
+                <w:b/>
+                <w:bCs/>
+                <w:sz w:val="20"/>
+                <w:szCs w:val="20"/>
+              </w:rPr>
+              <w:t xml:space="preserve">추가 조치</w:t>
+            </w:r>
+          </w:p>
+        </w:tc>
+      </w:tr>
+      <w:tr>
+        <w:trPr>
+          <w:trHeight w:val="566" w:hRule="atLeast"/>
+        </w:trPr>
+        <w:tc>
+          <w:tcPr>
+            <w:tcW w:type="dxa" w:w="9637"/>
+            <w:tcBorders>
+              <w:top w:val="single" w:color="000000" w:sz="4"/>
+              <w:left w:val="single" w:color="000000" w:sz="4"/>
+              <w:bottom w:val="single" w:color="000000" w:sz="4"/>
+              <w:right w:val="single" w:color="000000" w:sz="4"/>
+            </w:tcBorders>
+            <w:shd w:fill="F5F5F5" w:color="auto" w:val="clear"/>
+            <w:tcMar>
+              <w:top w:type="dxa" w:w="170"/>
+              <w:left w:type="dxa" w:w="170"/>
+              <w:bottom w:type="dxa" w:w="170"/>
+              <w:right w:type="dxa" w:w="170"/>
+            </w:tcMar>
+          </w:tcPr>
+          <w:p>
+            <w:r>
+              <w:t xml:space="preserve"/>
+            </w:r>
+          </w:p>
+        </w:tc>
+      </w:tr>
+    </w:tbl>
+    <w:p>
+      <w:pPr>
+        <w:spacing w:after="80" w:before="80"/>
+      </w:pPr>
+      <w:r>
+        <w:t xml:space="preserve"/>
+      </w:r>
+    </w:p>
+    <w:tbl>
+      <w:tblPr>
+        <w:tblW w:type="dxa" w:w="9637"/>
+        <w:tblBorders>
+          <w:top w:val="single" w:color="auto" w:sz="4"/>
+          <w:left w:val="single" w:color="auto" w:sz="4"/>
+          <w:bottom w:val="single" w:color="auto" w:sz="4"/>
+          <w:right w:val="single" w:color="auto" w:sz="4"/>
+          <w:insideH w:val="single" w:color="auto" w:sz="4"/>
+          <w:insideV w:val="single" w:color="auto" w:sz="4"/>
+        </w:tblBorders>
+        <w:tblLayout w:type="fixed"/>
+      </w:tblPr>
+      <w:tblGrid>
+        <w:gridCol w:w="9637"/>
+      </w:tblGrid>
+      <w:tr>
+        <w:trPr>
+          <w:trHeight w:val="396" w:hRule="atLeast"/>
+        </w:trPr>
+        <w:tc>
+          <w:tcPr>
+            <w:tcW w:type="dxa" w:w="9637"/>
+            <w:tcBorders>
+              <w:top w:val="single" w:color="000000" w:sz="4"/>
+              <w:left w:val="single" w:color="000000" w:sz="4"/>
+              <w:bottom w:val="single" w:color="000000" w:sz="4"/>
+              <w:right w:val="single" w:color="000000" w:sz="4"/>
+            </w:tcBorders>
+            <w:shd w:fill="E8E8E8" w:color="auto" w:val="clear"/>
+            <w:tcMar>
+              <w:top w:type="dxa" w:w="170"/>
+              <w:left w:type="dxa" w:w="170"/>
+              <w:bottom w:type="dxa" w:w="170"/>
+              <w:right w:type="dxa" w:w="170"/>
+            </w:tcMar>
+            <w:vAlign w:val="center"/>
+          </w:tcPr>
+          <w:p>
+            <w:pPr>
+              <w:jc w:val="center"/>
+            </w:pPr>
+            <w:r>
+              <w:rPr>
+                <w:rFonts w:ascii="NanumGothic" w:cs="NanumGothic" w:eastAsia="NanumGothic" w:hAnsi="NanumGothic"/>
+                <w:b/>
+                <w:bCs/>
+                <w:sz w:val="20"/>
+                <w:szCs w:val="20"/>
+              </w:rPr>
+              <w:t xml:space="preserve">격리·방호 실시 내역</w:t>
+            </w:r>
+          </w:p>
+        </w:tc>
+      </w:tr>
+      <w:tr>
+        <w:trPr>
+          <w:trHeight w:val="793" w:hRule="atLeast"/>
+        </w:trPr>
+        <w:tc>
+          <w:tcPr>
+            <w:tcW w:type="dxa" w:w="9637"/>
+            <w:tcBorders>
+              <w:top w:val="single" w:color="000000" w:sz="4"/>
+              <w:left w:val="single" w:color="000000" w:sz="4"/>
+              <w:bottom w:val="single" w:color="000000" w:sz="4"/>
+              <w:right w:val="single" w:color="000000" w:sz="4"/>
+            </w:tcBorders>
+            <w:shd w:fill="F5F5F5" w:color="auto" w:val="clear"/>
+            <w:tcMar>
+              <w:top w:type="dxa" w:w="170"/>
+              <w:left w:type="dxa" w:w="170"/>
+              <w:bottom w:type="dxa" w:w="170"/>
+              <w:right w:type="dxa" w:w="170"/>
+            </w:tcMar>
+          </w:tcPr>
+          <w:p>
+            <w:r>
+              <w:t xml:space="preserve"/>
+            </w:r>
+          </w:p>
+        </w:tc>
+      </w:tr>
+    </w:tbl>
+    <w:p>
+      <w:pPr>
+        <w:spacing w:after="80" w:before="80"/>
+      </w:pPr>
+      <w:r>
+        <w:t xml:space="preserve"/>
+      </w:r>
+    </w:p>
+    <w:tbl>
+      <w:tblPr>
+        <w:tblW w:type="dxa" w:w="9637"/>
+        <w:tblBorders>
+          <w:top w:val="single" w:color="auto" w:sz="4"/>
+          <w:left w:val="single" w:color="auto" w:sz="4"/>
+          <w:bottom w:val="single" w:color="auto" w:sz="4"/>
+          <w:right w:val="single" w:color="auto" w:sz="4"/>
+          <w:insideH w:val="single" w:color="auto" w:sz="4"/>
+          <w:insideV w:val="single" w:color="auto" w:sz="4"/>
+        </w:tblBorders>
+        <w:tblLayout w:type="fixed"/>
+      </w:tblPr>
+      <w:tblGrid>
+        <w:gridCol w:w="9637"/>
+      </w:tblGrid>
+      <w:tr>
+        <w:trPr>
+          <w:trHeight w:val="396" w:hRule="atLeast"/>
+        </w:trPr>
+        <w:tc>
+          <w:tcPr>
+            <w:tcW w:type="dxa" w:w="9637"/>
+            <w:tcBorders>
+              <w:top w:val="single" w:color="000000" w:sz="4"/>
+              <w:left w:val="single" w:color="000000" w:sz="4"/>
+              <w:bottom w:val="single" w:color="000000" w:sz="4"/>
+              <w:right w:val="single" w:color="000000" w:sz="4"/>
+            </w:tcBorders>
+            <w:shd w:fill="E8E8E8" w:color="auto" w:val="clear"/>
+            <w:tcMar>
+              <w:top w:type="dxa" w:w="170"/>
+              <w:left w:type="dxa" w:w="170"/>
+              <w:bottom w:type="dxa" w:w="170"/>
+              <w:right w:type="dxa" w:w="170"/>
+            </w:tcMar>
+            <w:vAlign w:val="center"/>
+          </w:tcPr>
+          <w:p>
+            <w:pPr>
+              <w:jc w:val="center"/>
+            </w:pPr>
+            <w:r>
+              <w:rPr>
+                <w:rFonts w:ascii="NanumGothic" w:cs="NanumGothic" w:eastAsia="NanumGothic" w:hAnsi="NanumGothic"/>
+                <w:b/>
+                <w:bCs/>
+                <w:sz w:val="20"/>
+                <w:szCs w:val="20"/>
+              </w:rPr>
+              <w:t xml:space="preserve">미완료 조치 및 특이사항</w:t>
+            </w:r>
+          </w:p>
+        </w:tc>
+      </w:tr>
+      <w:tr>
+        <w:trPr>
+          <w:trHeight w:val="566" w:hRule="atLeast"/>
         </w:trPr>
         <w:tc>
           <w:tcPr>

</xml_diff>